<commit_message>
First commit Section 1 update doc
</commit_message>
<xml_diff>
--- a/Power BI for Business Intelligence.docx
+++ b/Power BI for Business Intelligence.docx
@@ -14,43 +14,19 @@
           <w:sz w:val="36"/>
           <w:szCs w:val="36"/>
         </w:rPr>
-        <w:t xml:space="preserve">SECTION 1: </w:t>
-      </w:r>
-      <w:proofErr w:type="spellStart"/>
-      <w:r>
-        <w:rPr>
-          <w:sz w:val="36"/>
-          <w:szCs w:val="36"/>
-        </w:rPr>
-        <w:t>Getting</w:t>
-      </w:r>
-      <w:proofErr w:type="spellEnd"/>
-      <w:r>
-        <w:rPr>
-          <w:sz w:val="36"/>
-          <w:szCs w:val="36"/>
-        </w:rPr>
-        <w:t xml:space="preserve"> </w:t>
-      </w:r>
-      <w:proofErr w:type="spellStart"/>
-      <w:r>
-        <w:rPr>
-          <w:sz w:val="36"/>
-          <w:szCs w:val="36"/>
-        </w:rPr>
-        <w:t>Started</w:t>
-      </w:r>
-      <w:proofErr w:type="spellEnd"/>
-    </w:p>
-    <w:p>
-      <w:pPr>
-        <w:rPr>
-          <w:sz w:val="36"/>
-          <w:szCs w:val="36"/>
-        </w:rPr>
-      </w:pPr>
-      <w:r>
-        <w:rPr>
+        <w:t>SECTION 1: Getting Started</w:t>
+      </w:r>
+    </w:p>
+    <w:p>
+      <w:pPr>
+        <w:rPr>
+          <w:sz w:val="36"/>
+          <w:szCs w:val="36"/>
+        </w:rPr>
+      </w:pPr>
+      <w:r>
+        <w:rPr>
+          <w:noProof/>
           <w:sz w:val="36"/>
           <w:szCs w:val="36"/>
         </w:rPr>
@@ -108,6 +84,7 @@
       </w:pPr>
       <w:r>
         <w:rPr>
+          <w:noProof/>
           <w:sz w:val="36"/>
           <w:szCs w:val="36"/>
         </w:rPr>
@@ -162,6 +139,56 @@
         </w:rPr>
         <w:lastRenderedPageBreak/>
         <w:drawing>
+          <wp:inline distT="0" distB="0" distL="0" distR="0" wp14:anchorId="14A6E77B" wp14:editId="6D858A3A">
+            <wp:extent cx="5731510" cy="2807335"/>
+            <wp:effectExtent l="0" t="0" r="2540" b="0"/>
+            <wp:docPr id="1101528230" name="Picture 1" descr="A close-up of a diagram&#10;&#10;Description automatically generated"/>
+            <wp:cNvGraphicFramePr>
+              <a:graphicFrameLocks xmlns:a="http://schemas.openxmlformats.org/drawingml/2006/main" noChangeAspect="1"/>
+            </wp:cNvGraphicFramePr>
+            <a:graphic xmlns:a="http://schemas.openxmlformats.org/drawingml/2006/main">
+              <a:graphicData uri="http://schemas.openxmlformats.org/drawingml/2006/picture">
+                <pic:pic xmlns:pic="http://schemas.openxmlformats.org/drawingml/2006/picture">
+                  <pic:nvPicPr>
+                    <pic:cNvPr id="1101528230" name="Picture 1" descr="A close-up of a diagram&#10;&#10;Description automatically generated"/>
+                    <pic:cNvPicPr/>
+                  </pic:nvPicPr>
+                  <pic:blipFill>
+                    <a:blip r:embed="rId6"/>
+                    <a:stretch>
+                      <a:fillRect/>
+                    </a:stretch>
+                  </pic:blipFill>
+                  <pic:spPr>
+                    <a:xfrm>
+                      <a:off x="0" y="0"/>
+                      <a:ext cx="5731510" cy="2807335"/>
+                    </a:xfrm>
+                    <a:prstGeom prst="rect">
+                      <a:avLst/>
+                    </a:prstGeom>
+                  </pic:spPr>
+                </pic:pic>
+              </a:graphicData>
+            </a:graphic>
+          </wp:inline>
+        </w:drawing>
+      </w:r>
+    </w:p>
+    <w:p>
+      <w:pPr>
+        <w:rPr>
+          <w:sz w:val="36"/>
+          <w:szCs w:val="36"/>
+        </w:rPr>
+      </w:pPr>
+      <w:r>
+        <w:rPr>
+          <w:noProof/>
+          <w:sz w:val="36"/>
+          <w:szCs w:val="36"/>
+        </w:rPr>
+        <w:drawing>
           <wp:inline distT="0" distB="0" distL="0" distR="0" wp14:anchorId="33F8EE73" wp14:editId="341C62EC">
             <wp:extent cx="5731510" cy="3314700"/>
             <wp:effectExtent l="0" t="0" r="2540" b="0"/>
@@ -177,7 +204,7 @@
                     <pic:cNvPicPr/>
                   </pic:nvPicPr>
                   <pic:blipFill>
-                    <a:blip r:embed="rId6"/>
+                    <a:blip r:embed="rId7"/>
                     <a:stretch>
                       <a:fillRect/>
                     </a:stretch>
@@ -215,9 +242,11 @@
       </w:pPr>
       <w:r>
         <w:rPr>
-          <w:sz w:val="36"/>
-          <w:szCs w:val="36"/>
-        </w:rPr>
+          <w:noProof/>
+          <w:sz w:val="36"/>
+          <w:szCs w:val="36"/>
+        </w:rPr>
+        <w:lastRenderedPageBreak/>
         <w:drawing>
           <wp:inline distT="0" distB="0" distL="0" distR="0" wp14:anchorId="097CBFCD" wp14:editId="5D1ED576">
             <wp:extent cx="5731510" cy="3114040"/>
@@ -234,7 +263,7 @@
                     <pic:cNvPicPr/>
                   </pic:nvPicPr>
                   <pic:blipFill>
-                    <a:blip r:embed="rId7"/>
+                    <a:blip r:embed="rId8"/>
                     <a:stretch>
                       <a:fillRect/>
                     </a:stretch>
@@ -264,10 +293,10 @@
       </w:pPr>
       <w:r>
         <w:rPr>
-          <w:sz w:val="36"/>
-          <w:szCs w:val="36"/>
-        </w:rPr>
-        <w:lastRenderedPageBreak/>
+          <w:noProof/>
+          <w:sz w:val="36"/>
+          <w:szCs w:val="36"/>
+        </w:rPr>
         <w:drawing>
           <wp:inline distT="0" distB="0" distL="0" distR="0" wp14:anchorId="3819C915" wp14:editId="26627E84">
             <wp:extent cx="5731510" cy="3105785"/>
@@ -284,7 +313,7 @@
                     <pic:cNvPicPr/>
                   </pic:nvPicPr>
                   <pic:blipFill>
-                    <a:blip r:embed="rId8"/>
+                    <a:blip r:embed="rId9"/>
                     <a:stretch>
                       <a:fillRect/>
                     </a:stretch>
@@ -314,9 +343,11 @@
       </w:pPr>
       <w:r>
         <w:rPr>
-          <w:sz w:val="36"/>
-          <w:szCs w:val="36"/>
-        </w:rPr>
+          <w:noProof/>
+          <w:sz w:val="36"/>
+          <w:szCs w:val="36"/>
+        </w:rPr>
+        <w:lastRenderedPageBreak/>
         <w:drawing>
           <wp:inline distT="0" distB="0" distL="0" distR="0" wp14:anchorId="07374FE3" wp14:editId="4F1972DC">
             <wp:extent cx="5731510" cy="3268980"/>
@@ -333,7 +364,7 @@
                     <pic:cNvPicPr/>
                   </pic:nvPicPr>
                   <pic:blipFill>
-                    <a:blip r:embed="rId9"/>
+                    <a:blip r:embed="rId10"/>
                     <a:stretch>
                       <a:fillRect/>
                     </a:stretch>
@@ -363,10 +394,10 @@
       </w:pPr>
       <w:r>
         <w:rPr>
-          <w:sz w:val="36"/>
-          <w:szCs w:val="36"/>
-        </w:rPr>
-        <w:lastRenderedPageBreak/>
+          <w:noProof/>
+          <w:sz w:val="36"/>
+          <w:szCs w:val="36"/>
+        </w:rPr>
         <w:drawing>
           <wp:inline distT="0" distB="0" distL="0" distR="0" wp14:anchorId="5BBDA128" wp14:editId="558120DF">
             <wp:extent cx="5731510" cy="3351530"/>
@@ -383,7 +414,7 @@
                     <pic:cNvPicPr/>
                   </pic:nvPicPr>
                   <pic:blipFill>
-                    <a:blip r:embed="rId10"/>
+                    <a:blip r:embed="rId11"/>
                     <a:stretch>
                       <a:fillRect/>
                     </a:stretch>
@@ -413,9 +444,11 @@
       </w:pPr>
       <w:r>
         <w:rPr>
-          <w:sz w:val="36"/>
-          <w:szCs w:val="36"/>
-        </w:rPr>
+          <w:noProof/>
+          <w:sz w:val="36"/>
+          <w:szCs w:val="36"/>
+        </w:rPr>
+        <w:lastRenderedPageBreak/>
         <w:drawing>
           <wp:inline distT="0" distB="0" distL="0" distR="0" wp14:anchorId="25E259D0" wp14:editId="5B674330">
             <wp:extent cx="5731510" cy="3246120"/>
@@ -432,7 +465,7 @@
                     <pic:cNvPicPr/>
                   </pic:nvPicPr>
                   <pic:blipFill>
-                    <a:blip r:embed="rId11"/>
+                    <a:blip r:embed="rId12"/>
                     <a:stretch>
                       <a:fillRect/>
                     </a:stretch>
@@ -470,10 +503,10 @@
       </w:pPr>
       <w:r>
         <w:rPr>
-          <w:sz w:val="36"/>
-          <w:szCs w:val="36"/>
-        </w:rPr>
-        <w:lastRenderedPageBreak/>
+          <w:noProof/>
+          <w:sz w:val="36"/>
+          <w:szCs w:val="36"/>
+        </w:rPr>
         <w:drawing>
           <wp:inline distT="0" distB="0" distL="0" distR="0" wp14:anchorId="78621A35" wp14:editId="0BC3D630">
             <wp:extent cx="5731510" cy="3070860"/>
@@ -490,7 +523,7 @@
                     <pic:cNvPicPr/>
                   </pic:nvPicPr>
                   <pic:blipFill>
-                    <a:blip r:embed="rId12"/>
+                    <a:blip r:embed="rId13"/>
                     <a:stretch>
                       <a:fillRect/>
                     </a:stretch>
@@ -520,9 +553,11 @@
       </w:pPr>
       <w:r>
         <w:rPr>
-          <w:sz w:val="36"/>
-          <w:szCs w:val="36"/>
-        </w:rPr>
+          <w:noProof/>
+          <w:sz w:val="36"/>
+          <w:szCs w:val="36"/>
+        </w:rPr>
+        <w:lastRenderedPageBreak/>
         <w:drawing>
           <wp:inline distT="0" distB="0" distL="0" distR="0" wp14:anchorId="48C87FE4" wp14:editId="4DE82064">
             <wp:extent cx="5731510" cy="3094355"/>
@@ -539,7 +574,7 @@
                     <pic:cNvPicPr/>
                   </pic:nvPicPr>
                   <pic:blipFill>
-                    <a:blip r:embed="rId13"/>
+                    <a:blip r:embed="rId14"/>
                     <a:stretch>
                       <a:fillRect/>
                     </a:stretch>
@@ -584,6 +619,7 @@
       </w:pPr>
       <w:r>
         <w:rPr>
+          <w:noProof/>
           <w:sz w:val="36"/>
           <w:szCs w:val="36"/>
         </w:rPr>
@@ -604,7 +640,7 @@
                     <pic:cNvPicPr/>
                   </pic:nvPicPr>
                   <pic:blipFill>
-                    <a:blip r:embed="rId14"/>
+                    <a:blip r:embed="rId15"/>
                     <a:stretch>
                       <a:fillRect/>
                     </a:stretch>
@@ -634,6 +670,7 @@
       </w:pPr>
       <w:r>
         <w:rPr>
+          <w:noProof/>
           <w:sz w:val="36"/>
           <w:szCs w:val="36"/>
         </w:rPr>
@@ -653,7 +690,7 @@
                     <pic:cNvPicPr/>
                   </pic:nvPicPr>
                   <pic:blipFill>
-                    <a:blip r:embed="rId15"/>
+                    <a:blip r:embed="rId16"/>
                     <a:stretch>
                       <a:fillRect/>
                     </a:stretch>
@@ -683,6 +720,7 @@
       </w:pPr>
       <w:r>
         <w:rPr>
+          <w:noProof/>
           <w:sz w:val="36"/>
           <w:szCs w:val="36"/>
         </w:rPr>
@@ -703,7 +741,7 @@
                     <pic:cNvPicPr/>
                   </pic:nvPicPr>
                   <pic:blipFill>
-                    <a:blip r:embed="rId16"/>
+                    <a:blip r:embed="rId17"/>
                     <a:stretch>
                       <a:fillRect/>
                     </a:stretch>
@@ -733,6 +771,7 @@
       </w:pPr>
       <w:r>
         <w:rPr>
+          <w:noProof/>
           <w:sz w:val="36"/>
           <w:szCs w:val="36"/>
         </w:rPr>
@@ -752,7 +791,7 @@
                     <pic:cNvPicPr/>
                   </pic:nvPicPr>
                   <pic:blipFill>
-                    <a:blip r:embed="rId17"/>
+                    <a:blip r:embed="rId18"/>
                     <a:stretch>
                       <a:fillRect/>
                     </a:stretch>
@@ -782,6 +821,7 @@
       </w:pPr>
       <w:r>
         <w:rPr>
+          <w:noProof/>
           <w:sz w:val="36"/>
           <w:szCs w:val="36"/>
         </w:rPr>
@@ -802,7 +842,7 @@
                     <pic:cNvPicPr/>
                   </pic:nvPicPr>
                   <pic:blipFill>
-                    <a:blip r:embed="rId18"/>
+                    <a:blip r:embed="rId19"/>
                     <a:stretch>
                       <a:fillRect/>
                     </a:stretch>
@@ -832,6 +872,7 @@
       </w:pPr>
       <w:r>
         <w:rPr>
+          <w:noProof/>
           <w:sz w:val="36"/>
           <w:szCs w:val="36"/>
         </w:rPr>
@@ -851,7 +892,7 @@
                     <pic:cNvPicPr/>
                   </pic:nvPicPr>
                   <pic:blipFill>
-                    <a:blip r:embed="rId19"/>
+                    <a:blip r:embed="rId20"/>
                     <a:stretch>
                       <a:fillRect/>
                     </a:stretch>
@@ -889,6 +930,7 @@
       </w:pPr>
       <w:r>
         <w:rPr>
+          <w:noProof/>
           <w:sz w:val="36"/>
           <w:szCs w:val="36"/>
         </w:rPr>
@@ -909,7 +951,7 @@
                     <pic:cNvPicPr/>
                   </pic:nvPicPr>
                   <pic:blipFill>
-                    <a:blip r:embed="rId20"/>
+                    <a:blip r:embed="rId21"/>
                     <a:stretch>
                       <a:fillRect/>
                     </a:stretch>
@@ -939,6 +981,7 @@
       </w:pPr>
       <w:r>
         <w:rPr>
+          <w:noProof/>
           <w:sz w:val="36"/>
           <w:szCs w:val="36"/>
         </w:rPr>
@@ -958,7 +1001,7 @@
                     <pic:cNvPicPr/>
                   </pic:nvPicPr>
                   <pic:blipFill>
-                    <a:blip r:embed="rId21"/>
+                    <a:blip r:embed="rId22"/>
                     <a:stretch>
                       <a:fillRect/>
                     </a:stretch>
@@ -988,6 +1031,7 @@
       </w:pPr>
       <w:r>
         <w:rPr>
+          <w:noProof/>
           <w:sz w:val="36"/>
           <w:szCs w:val="36"/>
         </w:rPr>
@@ -1008,7 +1052,7 @@
                     <pic:cNvPicPr/>
                   </pic:nvPicPr>
                   <pic:blipFill>
-                    <a:blip r:embed="rId22"/>
+                    <a:blip r:embed="rId23"/>
                     <a:stretch>
                       <a:fillRect/>
                     </a:stretch>

</xml_diff>

<commit_message>
Section 2 first commit
</commit_message>
<xml_diff>
--- a/Power BI for Business Intelligence.docx
+++ b/Power BI for Business Intelligence.docx
@@ -1,6 +1,6 @@
 
 <file path=word/document.xml><?xml version="1.0" encoding="utf-8"?>
-<w:document xmlns:wpc="http://schemas.microsoft.com/office/word/2010/wordprocessingCanvas" xmlns:cx="http://schemas.microsoft.com/office/drawing/2014/chartex" xmlns:cx1="http://schemas.microsoft.com/office/drawing/2015/9/8/chartex" xmlns:cx2="http://schemas.microsoft.com/office/drawing/2015/10/21/chartex" xmlns:cx3="http://schemas.microsoft.com/office/drawing/2016/5/9/chartex" xmlns:cx4="http://schemas.microsoft.com/office/drawing/2016/5/10/chartex" xmlns:cx5="http://schemas.microsoft.com/office/drawing/2016/5/11/chartex" xmlns:cx6="http://schemas.microsoft.com/office/drawing/2016/5/12/chartex" xmlns:cx7="http://schemas.microsoft.com/office/drawing/2016/5/13/chartex" xmlns:cx8="http://schemas.microsoft.com/office/drawing/2016/5/14/chartex" xmlns:mc="http://schemas.openxmlformats.org/markup-compatibility/2006" xmlns:aink="http://schemas.microsoft.com/office/drawing/2016/ink" xmlns:am3d="http://schemas.microsoft.com/office/drawing/2017/model3d" xmlns:o="urn:schemas-microsoft-com:office:office" xmlns:oel="http://schemas.microsoft.com/office/2019/extlst" xmlns:r="http://schemas.openxmlformats.org/officeDocument/2006/relationships" xmlns:m="http://schemas.openxmlformats.org/officeDocument/2006/math" xmlns:v="urn:schemas-microsoft-com:vml" xmlns:wp14="http://schemas.microsoft.com/office/word/2010/wordprocessingDrawing" xmlns:wp="http://schemas.openxmlformats.org/drawingml/2006/wordprocessingDrawing" xmlns:w10="urn:schemas-microsoft-com:office:word" xmlns:w="http://schemas.openxmlformats.org/wordprocessingml/2006/main" xmlns:w14="http://schemas.microsoft.com/office/word/2010/wordml" xmlns:w15="http://schemas.microsoft.com/office/word/2012/wordml" xmlns:w16cex="http://schemas.microsoft.com/office/word/2018/wordml/cex" xmlns:w16cid="http://schemas.microsoft.com/office/word/2016/wordml/cid" xmlns:w16="http://schemas.microsoft.com/office/word/2018/wordml" xmlns:w16sdtdh="http://schemas.microsoft.com/office/word/2020/wordml/sdtdatahash" xmlns:w16se="http://schemas.microsoft.com/office/word/2015/wordml/symex" xmlns:wpg="http://schemas.microsoft.com/office/word/2010/wordprocessingGroup" xmlns:wpi="http://schemas.microsoft.com/office/word/2010/wordprocessingInk" xmlns:wne="http://schemas.microsoft.com/office/word/2006/wordml" xmlns:wps="http://schemas.microsoft.com/office/word/2010/wordprocessingShape" mc:Ignorable="w14 w15 w16se w16cid w16 w16cex w16sdtdh wp14">
+<w:document xmlns:wpc="http://schemas.microsoft.com/office/word/2010/wordprocessingCanvas" xmlns:cx="http://schemas.microsoft.com/office/drawing/2014/chartex" xmlns:cx1="http://schemas.microsoft.com/office/drawing/2015/9/8/chartex" xmlns:cx2="http://schemas.microsoft.com/office/drawing/2015/10/21/chartex" xmlns:cx3="http://schemas.microsoft.com/office/drawing/2016/5/9/chartex" xmlns:cx4="http://schemas.microsoft.com/office/drawing/2016/5/10/chartex" xmlns:cx5="http://schemas.microsoft.com/office/drawing/2016/5/11/chartex" xmlns:cx6="http://schemas.microsoft.com/office/drawing/2016/5/12/chartex" xmlns:cx7="http://schemas.microsoft.com/office/drawing/2016/5/13/chartex" xmlns:cx8="http://schemas.microsoft.com/office/drawing/2016/5/14/chartex" xmlns:mc="http://schemas.openxmlformats.org/markup-compatibility/2006" xmlns:aink="http://schemas.microsoft.com/office/drawing/2016/ink" xmlns:am3d="http://schemas.microsoft.com/office/drawing/2017/model3d" xmlns:o="urn:schemas-microsoft-com:office:office" xmlns:r="http://schemas.openxmlformats.org/officeDocument/2006/relationships" xmlns:m="http://schemas.openxmlformats.org/officeDocument/2006/math" xmlns:v="urn:schemas-microsoft-com:vml" xmlns:wp14="http://schemas.microsoft.com/office/word/2010/wordprocessingDrawing" xmlns:wp="http://schemas.openxmlformats.org/drawingml/2006/wordprocessingDrawing" xmlns:w10="urn:schemas-microsoft-com:office:word" xmlns:w="http://schemas.openxmlformats.org/wordprocessingml/2006/main" xmlns:w14="http://schemas.microsoft.com/office/word/2010/wordml" xmlns:w15="http://schemas.microsoft.com/office/word/2012/wordml" xmlns:w16cex="http://schemas.microsoft.com/office/word/2018/wordml/cex" xmlns:w16cid="http://schemas.microsoft.com/office/word/2016/wordml/cid" xmlns:w16="http://schemas.microsoft.com/office/word/2018/wordml" xmlns:w16sdtdh="http://schemas.microsoft.com/office/word/2020/wordml/sdtdatahash" xmlns:w16se="http://schemas.microsoft.com/office/word/2015/wordml/symex" xmlns:wpg="http://schemas.microsoft.com/office/word/2010/wordprocessingGroup" xmlns:wpi="http://schemas.microsoft.com/office/word/2010/wordprocessingInk" xmlns:wne="http://schemas.microsoft.com/office/word/2006/wordml" xmlns:wps="http://schemas.microsoft.com/office/word/2010/wordprocessingShape" mc:Ignorable="w14 w15 w16se w16cid w16 w16cex w16sdtdh wp14">
   <w:body>
     <w:p>
       <w:pPr>
@@ -134,10 +134,10 @@
       </w:pPr>
       <w:r>
         <w:rPr>
-          <w:sz w:val="36"/>
-          <w:szCs w:val="36"/>
-        </w:rPr>
-        <w:lastRenderedPageBreak/>
+          <w:noProof/>
+          <w:sz w:val="36"/>
+          <w:szCs w:val="36"/>
+        </w:rPr>
         <w:drawing>
           <wp:inline distT="0" distB="0" distL="0" distR="0" wp14:anchorId="14A6E77B" wp14:editId="6D858A3A">
             <wp:extent cx="5731510" cy="2807335"/>
@@ -347,7 +347,6 @@
           <w:sz w:val="36"/>
           <w:szCs w:val="36"/>
         </w:rPr>
-        <w:lastRenderedPageBreak/>
         <w:drawing>
           <wp:inline distT="0" distB="0" distL="0" distR="0" wp14:anchorId="07374FE3" wp14:editId="4F1972DC">
             <wp:extent cx="5731510" cy="3268980"/>
@@ -557,7 +556,6 @@
           <w:sz w:val="36"/>
           <w:szCs w:val="36"/>
         </w:rPr>
-        <w:lastRenderedPageBreak/>
         <w:drawing>
           <wp:inline distT="0" distB="0" distL="0" distR="0" wp14:anchorId="48C87FE4" wp14:editId="4DE82064">
             <wp:extent cx="5731510" cy="3094355"/>
@@ -724,7 +722,6 @@
           <w:sz w:val="36"/>
           <w:szCs w:val="36"/>
         </w:rPr>
-        <w:lastRenderedPageBreak/>
         <w:drawing>
           <wp:inline distT="0" distB="0" distL="0" distR="0" wp14:anchorId="1C6A747F" wp14:editId="3B03DEB7">
             <wp:extent cx="5555461" cy="3894157"/>
@@ -934,7 +931,6 @@
           <w:sz w:val="36"/>
           <w:szCs w:val="36"/>
         </w:rPr>
-        <w:lastRenderedPageBreak/>
         <w:drawing>
           <wp:inline distT="0" distB="0" distL="0" distR="0" wp14:anchorId="3FCCEA3F" wp14:editId="2D03E861">
             <wp:extent cx="5731510" cy="3028950"/>
@@ -1071,6 +1067,231 @@
             </a:graphic>
           </wp:inline>
         </w:drawing>
+      </w:r>
+    </w:p>
+    <w:p>
+      <w:pPr>
+        <w:rPr>
+          <w:sz w:val="36"/>
+          <w:szCs w:val="36"/>
+        </w:rPr>
+      </w:pPr>
+    </w:p>
+    <w:p>
+      <w:pPr>
+        <w:rPr>
+          <w:sz w:val="36"/>
+          <w:szCs w:val="36"/>
+        </w:rPr>
+      </w:pPr>
+      <w:r>
+        <w:rPr>
+          <w:sz w:val="36"/>
+          <w:szCs w:val="36"/>
+        </w:rPr>
+        <w:t>Query Editor</w:t>
+      </w:r>
+    </w:p>
+    <w:p>
+      <w:pPr>
+        <w:rPr>
+          <w:sz w:val="36"/>
+          <w:szCs w:val="36"/>
+        </w:rPr>
+      </w:pPr>
+      <w:r>
+        <w:rPr>
+          <w:sz w:val="36"/>
+          <w:szCs w:val="36"/>
+        </w:rPr>
+        <w:drawing>
+          <wp:inline distT="0" distB="0" distL="0" distR="0" wp14:anchorId="1D59693A" wp14:editId="77BA50FA">
+            <wp:extent cx="5731510" cy="2269490"/>
+            <wp:effectExtent l="0" t="0" r="2540" b="0"/>
+            <wp:docPr id="1" name="Picture 1"/>
+            <wp:cNvGraphicFramePr>
+              <a:graphicFrameLocks xmlns:a="http://schemas.openxmlformats.org/drawingml/2006/main" noChangeAspect="1"/>
+            </wp:cNvGraphicFramePr>
+            <a:graphic xmlns:a="http://schemas.openxmlformats.org/drawingml/2006/main">
+              <a:graphicData uri="http://schemas.openxmlformats.org/drawingml/2006/picture">
+                <pic:pic xmlns:pic="http://schemas.openxmlformats.org/drawingml/2006/picture">
+                  <pic:nvPicPr>
+                    <pic:cNvPr id="1" name=""/>
+                    <pic:cNvPicPr/>
+                  </pic:nvPicPr>
+                  <pic:blipFill>
+                    <a:blip r:embed="rId24"/>
+                    <a:stretch>
+                      <a:fillRect/>
+                    </a:stretch>
+                  </pic:blipFill>
+                  <pic:spPr>
+                    <a:xfrm>
+                      <a:off x="0" y="0"/>
+                      <a:ext cx="5731510" cy="2269490"/>
+                    </a:xfrm>
+                    <a:prstGeom prst="rect">
+                      <a:avLst/>
+                    </a:prstGeom>
+                  </pic:spPr>
+                </pic:pic>
+              </a:graphicData>
+            </a:graphic>
+          </wp:inline>
+        </w:drawing>
+      </w:r>
+    </w:p>
+    <w:p>
+      <w:pPr>
+        <w:rPr>
+          <w:sz w:val="36"/>
+          <w:szCs w:val="36"/>
+          <w:lang w:val="en-US"/>
+        </w:rPr>
+      </w:pPr>
+      <w:r>
+        <w:rPr>
+          <w:sz w:val="36"/>
+          <w:szCs w:val="36"/>
+          <w:lang w:val="en-US"/>
+        </w:rPr>
+        <w:t>POWER QUERY EDITOR – M L</w:t>
+      </w:r>
+      <w:r>
+        <w:rPr>
+          <w:sz w:val="36"/>
+          <w:szCs w:val="36"/>
+          <w:lang w:val="en-US"/>
+        </w:rPr>
+        <w:t>anguage</w:t>
+      </w:r>
+    </w:p>
+    <w:p>
+      <w:pPr>
+        <w:rPr>
+          <w:sz w:val="36"/>
+          <w:szCs w:val="36"/>
+        </w:rPr>
+      </w:pPr>
+      <w:r>
+        <w:rPr>
+          <w:sz w:val="36"/>
+          <w:szCs w:val="36"/>
+        </w:rPr>
+        <w:drawing>
+          <wp:inline distT="0" distB="0" distL="0" distR="0" wp14:anchorId="2B350E6D" wp14:editId="0DA762D9">
+            <wp:extent cx="5731510" cy="3361690"/>
+            <wp:effectExtent l="0" t="0" r="2540" b="0"/>
+            <wp:docPr id="3" name="Picture 3"/>
+            <wp:cNvGraphicFramePr>
+              <a:graphicFrameLocks xmlns:a="http://schemas.openxmlformats.org/drawingml/2006/main" noChangeAspect="1"/>
+            </wp:cNvGraphicFramePr>
+            <a:graphic xmlns:a="http://schemas.openxmlformats.org/drawingml/2006/main">
+              <a:graphicData uri="http://schemas.openxmlformats.org/drawingml/2006/picture">
+                <pic:pic xmlns:pic="http://schemas.openxmlformats.org/drawingml/2006/picture">
+                  <pic:nvPicPr>
+                    <pic:cNvPr id="1" name=""/>
+                    <pic:cNvPicPr/>
+                  </pic:nvPicPr>
+                  <pic:blipFill>
+                    <a:blip r:embed="rId25"/>
+                    <a:stretch>
+                      <a:fillRect/>
+                    </a:stretch>
+                  </pic:blipFill>
+                  <pic:spPr>
+                    <a:xfrm>
+                      <a:off x="0" y="0"/>
+                      <a:ext cx="5731510" cy="3361690"/>
+                    </a:xfrm>
+                    <a:prstGeom prst="rect">
+                      <a:avLst/>
+                    </a:prstGeom>
+                  </pic:spPr>
+                </pic:pic>
+              </a:graphicData>
+            </a:graphic>
+          </wp:inline>
+        </w:drawing>
+      </w:r>
+    </w:p>
+    <w:p>
+      <w:pPr>
+        <w:rPr>
+          <w:sz w:val="28"/>
+          <w:szCs w:val="28"/>
+        </w:rPr>
+      </w:pPr>
+      <w:r>
+        <w:rPr>
+          <w:sz w:val="28"/>
+          <w:szCs w:val="28"/>
+        </w:rPr>
+        <w:t>Primary Tabs</w:t>
+      </w:r>
+    </w:p>
+    <w:p>
+      <w:pPr>
+        <w:rPr>
+          <w:sz w:val="28"/>
+          <w:szCs w:val="28"/>
+        </w:rPr>
+      </w:pPr>
+      <w:r>
+        <w:rPr>
+          <w:sz w:val="28"/>
+          <w:szCs w:val="28"/>
+        </w:rPr>
+        <w:drawing>
+          <wp:inline distT="0" distB="0" distL="0" distR="0" wp14:anchorId="2D64099C" wp14:editId="1060CAEE">
+            <wp:extent cx="5731510" cy="3382645"/>
+            <wp:effectExtent l="0" t="0" r="2540" b="8255"/>
+            <wp:docPr id="4" name="Picture 4"/>
+            <wp:cNvGraphicFramePr>
+              <a:graphicFrameLocks xmlns:a="http://schemas.openxmlformats.org/drawingml/2006/main" noChangeAspect="1"/>
+            </wp:cNvGraphicFramePr>
+            <a:graphic xmlns:a="http://schemas.openxmlformats.org/drawingml/2006/main">
+              <a:graphicData uri="http://schemas.openxmlformats.org/drawingml/2006/picture">
+                <pic:pic xmlns:pic="http://schemas.openxmlformats.org/drawingml/2006/picture">
+                  <pic:nvPicPr>
+                    <pic:cNvPr id="1" name=""/>
+                    <pic:cNvPicPr/>
+                  </pic:nvPicPr>
+                  <pic:blipFill>
+                    <a:blip r:embed="rId26"/>
+                    <a:stretch>
+                      <a:fillRect/>
+                    </a:stretch>
+                  </pic:blipFill>
+                  <pic:spPr>
+                    <a:xfrm>
+                      <a:off x="0" y="0"/>
+                      <a:ext cx="5731510" cy="3382645"/>
+                    </a:xfrm>
+                    <a:prstGeom prst="rect">
+                      <a:avLst/>
+                    </a:prstGeom>
+                  </pic:spPr>
+                </pic:pic>
+              </a:graphicData>
+            </a:graphic>
+          </wp:inline>
+        </w:drawing>
+      </w:r>
+    </w:p>
+    <w:p>
+      <w:pPr>
+        <w:rPr>
+          <w:sz w:val="28"/>
+          <w:szCs w:val="28"/>
+        </w:rPr>
+      </w:pPr>
+      <w:r>
+        <w:rPr>
+          <w:sz w:val="28"/>
+          <w:szCs w:val="28"/>
+        </w:rPr>
+        <w:t>BASIC TABLE TRANSFORMATIONS</w:t>
       </w:r>
     </w:p>
     <w:p>

</xml_diff>